<commit_message>
add project of iti
</commit_message>
<xml_diff>
--- a/projects/ai-customer-feedback-intelligence-system/docs/Project_Report.docx
+++ b/projects/ai-customer-feedback-intelligence-system/docs/Project_Report.docx
@@ -1236,7 +1236,7 @@
           <w:sz w:val="21"/>
           <w:szCs w:val="21"/>
         </w:rPr>
-        <w:t>Overall accuracy: 82.0%  |  Macro-average F1: 0.57  |  Weighted-average F1: 0.79</w:t>
+        <w:t>Overall accuracy: 82.1%  |  Macro-average F1: 0.57  |  Weighted-average F1: 0.80</w:t>
       </w:r>
     </w:p>
     <w:p>
@@ -1438,41 +1438,41 @@
                 <w:sz w:val="19"/>
                 <w:szCs w:val="19"/>
               </w:rPr>
-              <w:t>0.64</w:t>
-            </w:r>
-          </w:p>
-        </w:tc>
-        <w:tc>
-          <w:tcPr>
-            <w:tcW w:w="800" w:type="pct"/>
-          </w:tcPr>
-          <w:p>
-            <w:r>
-              <w:rPr>
-                <w:b w:val="0"/>
-                <w:bCs w:val="0"/>
-                <w:color w:val="000000"/>
-                <w:sz w:val="19"/>
-                <w:szCs w:val="19"/>
-              </w:rPr>
-              <w:t>0.14</w:t>
-            </w:r>
-          </w:p>
-        </w:tc>
-        <w:tc>
-          <w:tcPr>
-            <w:tcW w:w="800" w:type="pct"/>
-          </w:tcPr>
-          <w:p>
-            <w:r>
-              <w:rPr>
-                <w:b w:val="0"/>
-                <w:bCs w:val="0"/>
-                <w:color w:val="000000"/>
-                <w:sz w:val="19"/>
-                <w:szCs w:val="19"/>
-              </w:rPr>
-              <w:t>0.23</w:t>
+              <w:t>0.57</w:t>
+            </w:r>
+          </w:p>
+        </w:tc>
+        <w:tc>
+          <w:tcPr>
+            <w:tcW w:w="800" w:type="pct"/>
+          </w:tcPr>
+          <w:p>
+            <w:r>
+              <w:rPr>
+                <w:b w:val="0"/>
+                <w:bCs w:val="0"/>
+                <w:color w:val="000000"/>
+                <w:sz w:val="19"/>
+                <w:szCs w:val="19"/>
+              </w:rPr>
+              <w:t>0.13</w:t>
+            </w:r>
+          </w:p>
+        </w:tc>
+        <w:tc>
+          <w:tcPr>
+            <w:tcW w:w="800" w:type="pct"/>
+          </w:tcPr>
+          <w:p>
+            <w:r>
+              <w:rPr>
+                <w:b w:val="0"/>
+                <w:bCs w:val="0"/>
+                <w:color w:val="000000"/>
+                <w:sz w:val="19"/>
+                <w:szCs w:val="19"/>
+              </w:rPr>
+              <w:t>0.21</w:t>
             </w:r>
           </w:p>
         </w:tc>
@@ -1541,7 +1541,7 @@
                 <w:sz w:val="19"/>
                 <w:szCs w:val="19"/>
               </w:rPr>
-              <w:t>0.44</w:t>
+              <w:t>0.47</w:t>
             </w:r>
           </w:p>
         </w:tc>
@@ -1712,7 +1712,7 @@
           <w:sz w:val="21"/>
           <w:szCs w:val="21"/>
         </w:rPr>
-        <w:t>Overall accuracy: 78.5%  |  Macro-average F1: 0.39  |  Weighted-average F1: 0.73</w:t>
+        <w:t>Overall accuracy: 78.3%  |  Macro-average F1: 0.38  |  Weighted-average F1: 0.71</w:t>
       </w:r>
     </w:p>
     <w:p>
@@ -1740,7 +1740,7 @@
           <w:sz w:val="21"/>
           <w:szCs w:val="21"/>
         </w:rPr>
-        <w:t>Logistic Regression outperforms Random Forest overall (82.0% vs 78.5% accuracy) and on the two minority classes that matter most for the business: it recovers 41% of Negative reviews and 23% of Neutral reviews, versus only 14% and 2% for Random Forest, which is heavily biased toward the majority Positive class (1.00 recall). Re-training with class_weight='balanced' changes the trade-off: Logistic Regression reaches Negative recall 0.58, Neutral recall 0.49 and Macro F1 0.60, while accuracy falls to 77.1%; the balanced Random Forest reaches 81.0% accuracy, Macro F1 0.56 and Negative recall 0.45. Because missing a real complaint is costlier than a false alarm, the balanced Logistic Regression best fits the business goal, while plain Logistic Regression is preferable if overall accuracy is the priority. This choice was made on a single test split, so cross-validation is advisable before deployment.</w:t>
+        <w:t>Logistic Regression outperforms Random Forest overall (82.1% vs 78.3% accuracy) and on the two minority classes that matter most for the business: it recovers 41% of Negative reviews and 23% of Neutral reviews, versus only 13% and 2% for Random Forest, which is heavily biased toward the majority Positive class (1.00 recall). Re-training with class_weight='balanced' changes the picture for Logistic Regression: Negative recall rises to 0.57, Neutral recall to 0.49 and Macro F1 to 0.60, while accuracy falls to 77.0%. Random Forest barely reacts to class weights (accuracy 78.7%, Macro F1 0.39, Negative recall 0.15). Because missing a real complaint is costlier than a false alarm, the balanced Logistic Regression best fits the business goal, while plain Logistic Regression is preferable if overall accuracy is the priority. This choice was made on a single test split, so cross-validation is advisable before deployment.</w:t>
       </w:r>
     </w:p>
     <w:p>
@@ -1951,7 +1951,7 @@
           <w:sz w:val="21"/>
           <w:szCs w:val="21"/>
         </w:rPr>
-        <w:t>The system meets the core brief: it cleans and prepares 22,622 real customer reviews, engineers TF-IDF features without test-set leakage, trains and compares two supervised classifiers (with and without class weights), and applies K-Means to unsupervised discovery of complaint themes, with supporting visualizations. Logistic Regression reaches 82.0% accuracy and is the stronger of the two models; class weighting lifts its Negative recall from 0.41 to 0.58 at the cost of accuracy (77.1%). Neutral reviews remain the hardest class, most often predicted as Positive, a consequence of the 77/12/11 class imbalance in the source data.</w:t>
+        <w:t>The system meets the core brief: it cleans and prepares 22,622 real customer reviews, engineers TF-IDF features without test-set leakage, trains and compares two supervised classifiers (with and without class weights), and applies K-Means to unsupervised discovery of complaint themes, with supporting visualizations. Logistic Regression reaches 82.1% accuracy and is the stronger of the two models; class weighting lifts its Negative recall from 0.41 to 0.57 at the cost of accuracy (77.0%). Neutral reviews remain the hardest class, most often predicted as Positive, a consequence of the 77/12/11 class imbalance in the source data.</w:t>
       </w:r>
     </w:p>
     <w:p>

</xml_diff>